<commit_message>
added comments to godot scripts
</commit_message>
<xml_diff>
--- a/docs/Full_Report_Revised_Final_Results_Draft.docx
+++ b/docs/Full_Report_Revised_Final_Results_Draft.docx
@@ -7592,11 +7592,21 @@
       <w:r>
         <w:t xml:space="preserve">Figure </w:t>
       </w:r>
-      <w:fldSimple w:instr=" SEQ Figure \* ARABIC ">
-        <w:r>
-          <w:t>1</w:t>
-        </w:r>
-      </w:fldSimple>
+      <w:r>
+        <w:fldChar w:fldCharType="begin"/>
+      </w:r>
+      <w:r>
+        <w:instrText xml:space="preserve"> SEQ Figure \* ARABIC </w:instrText>
+      </w:r>
+      <w:r>
+        <w:fldChar w:fldCharType="separate"/>
+      </w:r>
+      <w:r>
+        <w:t>1</w:t>
+      </w:r>
+      <w:r>
+        <w:fldChar w:fldCharType="end"/>
+      </w:r>
       <w:r>
         <w:t>. Death rate by difficulty system and simulated player profile.</w:t>
       </w:r>
@@ -7675,11 +7685,21 @@
       <w:r>
         <w:t xml:space="preserve">Figure </w:t>
       </w:r>
-      <w:fldSimple w:instr=" SEQ Figure \* ARABIC ">
-        <w:r>
-          <w:t>2</w:t>
-        </w:r>
-      </w:fldSimple>
+      <w:r>
+        <w:fldChar w:fldCharType="begin"/>
+      </w:r>
+      <w:r>
+        <w:instrText xml:space="preserve"> SEQ Figure \* ARABIC </w:instrText>
+      </w:r>
+      <w:r>
+        <w:fldChar w:fldCharType="separate"/>
+      </w:r>
+      <w:r>
+        <w:t>2</w:t>
+      </w:r>
+      <w:r>
+        <w:fldChar w:fldCharType="end"/>
+      </w:r>
       <w:r>
         <w:t>. Average survival time by difficulty system and simulated player profile.</w:t>
       </w:r>
@@ -8382,11 +8402,21 @@
       <w:r>
         <w:t xml:space="preserve">Figure </w:t>
       </w:r>
-      <w:fldSimple w:instr=" SEQ Figure \* ARABIC ">
-        <w:r>
-          <w:t>3</w:t>
-        </w:r>
-      </w:fldSimple>
+      <w:r>
+        <w:fldChar w:fldCharType="begin"/>
+      </w:r>
+      <w:r>
+        <w:instrText xml:space="preserve"> SEQ Figure \* ARABIC </w:instrText>
+      </w:r>
+      <w:r>
+        <w:fldChar w:fldCharType="separate"/>
+      </w:r>
+      <w:r>
+        <w:t>3</w:t>
+      </w:r>
+      <w:r>
+        <w:fldChar w:fldCharType="end"/>
+      </w:r>
       <w:r>
         <w:t>. Mean time spent within the target balance range for rule-based and RL-based DDA.</w:t>
       </w:r>
@@ -8465,11 +8495,21 @@
       <w:r>
         <w:t xml:space="preserve">Figure </w:t>
       </w:r>
-      <w:fldSimple w:instr=" SEQ Figure \* ARABIC ">
-        <w:r>
-          <w:t>4</w:t>
-        </w:r>
-      </w:fldSimple>
+      <w:r>
+        <w:fldChar w:fldCharType="begin"/>
+      </w:r>
+      <w:r>
+        <w:instrText xml:space="preserve"> SEQ Figure \* ARABIC </w:instrText>
+      </w:r>
+      <w:r>
+        <w:fldChar w:fldCharType="separate"/>
+      </w:r>
+      <w:r>
+        <w:t>4</w:t>
+      </w:r>
+      <w:r>
+        <w:fldChar w:fldCharType="end"/>
+      </w:r>
       <w:r>
         <w:t>. Distribution of target-range occupancy for rule-based and RL-based DDA.</w:t>
       </w:r>
@@ -8550,11 +8590,21 @@
       <w:r>
         <w:t xml:space="preserve">Figure </w:t>
       </w:r>
-      <w:fldSimple w:instr=" SEQ Figure \* ARABIC ">
-        <w:r>
-          <w:t>5</w:t>
-        </w:r>
-      </w:fldSimple>
+      <w:r>
+        <w:fldChar w:fldCharType="begin"/>
+      </w:r>
+      <w:r>
+        <w:instrText xml:space="preserve"> SEQ Figure \* ARABIC </w:instrText>
+      </w:r>
+      <w:r>
+        <w:fldChar w:fldCharType="separate"/>
+      </w:r>
+      <w:r>
+        <w:t>5</w:t>
+      </w:r>
+      <w:r>
+        <w:fldChar w:fldCharType="end"/>
+      </w:r>
       <w:r>
         <w:t>. Average difficulty by system and simulated player profile.</w:t>
       </w:r>
@@ -8625,11 +8675,21 @@
       <w:r>
         <w:t xml:space="preserve">Figure </w:t>
       </w:r>
-      <w:fldSimple w:instr=" SEQ Figure \* ARABIC ">
-        <w:r>
-          <w:t>6</w:t>
-        </w:r>
-      </w:fldSimple>
+      <w:r>
+        <w:fldChar w:fldCharType="begin"/>
+      </w:r>
+      <w:r>
+        <w:instrText xml:space="preserve"> SEQ Figure \* ARABIC </w:instrText>
+      </w:r>
+      <w:r>
+        <w:fldChar w:fldCharType="separate"/>
+      </w:r>
+      <w:r>
+        <w:t>6</w:t>
+      </w:r>
+      <w:r>
+        <w:fldChar w:fldCharType="end"/>
+      </w:r>
       <w:r>
         <w:t>. Average number of difficulty changes by system and simulated player profile.</w:t>
       </w:r>
@@ -8700,11 +8760,21 @@
       <w:r>
         <w:t xml:space="preserve">Figure </w:t>
       </w:r>
-      <w:fldSimple w:instr=" SEQ Figure \* ARABIC ">
-        <w:r>
-          <w:t>7</w:t>
-        </w:r>
-      </w:fldSimple>
+      <w:r>
+        <w:fldChar w:fldCharType="begin"/>
+      </w:r>
+      <w:r>
+        <w:instrText xml:space="preserve"> SEQ Figure \* ARABIC </w:instrText>
+      </w:r>
+      <w:r>
+        <w:fldChar w:fldCharType="separate"/>
+      </w:r>
+      <w:r>
+        <w:t>7</w:t>
+      </w:r>
+      <w:r>
+        <w:fldChar w:fldCharType="end"/>
+      </w:r>
       <w:r>
         <w:t>. Mean minimum, episode-average and mean maximum difficulty reached by the RL controller.</w:t>
       </w:r>
@@ -8786,11 +8856,21 @@
         <w:lastRenderedPageBreak/>
         <w:t xml:space="preserve">Figure </w:t>
       </w:r>
-      <w:fldSimple w:instr=" SEQ Figure \* ARABIC ">
-        <w:r>
-          <w:t>8</w:t>
-        </w:r>
-      </w:fldSimple>
+      <w:r>
+        <w:fldChar w:fldCharType="begin"/>
+      </w:r>
+      <w:r>
+        <w:instrText xml:space="preserve"> SEQ Figure \* ARABIC </w:instrText>
+      </w:r>
+      <w:r>
+        <w:fldChar w:fldCharType="separate"/>
+      </w:r>
+      <w:r>
+        <w:t>8</w:t>
+      </w:r>
+      <w:r>
+        <w:fldChar w:fldCharType="end"/>
+      </w:r>
       <w:r>
         <w:t>. Five-run rolling survival trend for the improving simulated player profile.</w:t>
       </w:r>
@@ -8868,11 +8948,21 @@
       <w:r>
         <w:t xml:space="preserve">Figure </w:t>
       </w:r>
-      <w:fldSimple w:instr=" SEQ Figure \* ARABIC ">
-        <w:r>
-          <w:t>9</w:t>
-        </w:r>
-      </w:fldSimple>
+      <w:r>
+        <w:fldChar w:fldCharType="begin"/>
+      </w:r>
+      <w:r>
+        <w:instrText xml:space="preserve"> SEQ Figure \* ARABIC </w:instrText>
+      </w:r>
+      <w:r>
+        <w:fldChar w:fldCharType="separate"/>
+      </w:r>
+      <w:r>
+        <w:t>9</w:t>
+      </w:r>
+      <w:r>
+        <w:fldChar w:fldCharType="end"/>
+      </w:r>
       <w:r>
         <w:t>. Absolute distance from a 50% failure-rate reference.</w:t>
       </w:r>
@@ -8965,11 +9055,21 @@
       <w:r>
         <w:t xml:space="preserve">Figure </w:t>
       </w:r>
-      <w:fldSimple w:instr=" SEQ Figure \* ARABIC ">
-        <w:r>
-          <w:t>10</w:t>
-        </w:r>
-      </w:fldSimple>
+      <w:r>
+        <w:fldChar w:fldCharType="begin"/>
+      </w:r>
+      <w:r>
+        <w:instrText xml:space="preserve"> SEQ Figure \* ARABIC </w:instrText>
+      </w:r>
+      <w:r>
+        <w:fldChar w:fldCharType="separate"/>
+      </w:r>
+      <w:r>
+        <w:t>10</w:t>
+      </w:r>
+      <w:r>
+        <w:fldChar w:fldCharType="end"/>
+      </w:r>
       <w:r>
         <w:t>. Average RL difficulty changes under deterministic and stochastic PPO inference.</w:t>
       </w:r>
@@ -9048,11 +9148,21 @@
       <w:r>
         <w:t xml:space="preserve">Figure </w:t>
       </w:r>
-      <w:fldSimple w:instr=" SEQ Figure \* ARABIC ">
-        <w:r>
-          <w:t>11</w:t>
-        </w:r>
-      </w:fldSimple>
+      <w:r>
+        <w:fldChar w:fldCharType="begin"/>
+      </w:r>
+      <w:r>
+        <w:instrText xml:space="preserve"> SEQ Figure \* ARABIC </w:instrText>
+      </w:r>
+      <w:r>
+        <w:fldChar w:fldCharType="separate"/>
+      </w:r>
+      <w:r>
+        <w:t>11</w:t>
+      </w:r>
+      <w:r>
+        <w:fldChar w:fldCharType="end"/>
+      </w:r>
       <w:r>
         <w:t>. Difficulty-change frequency during PPO training and stochastic evaluation.</w:t>
       </w:r>
@@ -9123,11 +9233,21 @@
       <w:r>
         <w:t xml:space="preserve">Figure </w:t>
       </w:r>
-      <w:fldSimple w:instr=" SEQ Figure \* ARABIC ">
-        <w:r>
-          <w:t>12</w:t>
-        </w:r>
-      </w:fldSimple>
+      <w:r>
+        <w:fldChar w:fldCharType="begin"/>
+      </w:r>
+      <w:r>
+        <w:instrText xml:space="preserve"> SEQ Figure \* ARABIC </w:instrText>
+      </w:r>
+      <w:r>
+        <w:fldChar w:fldCharType="separate"/>
+      </w:r>
+      <w:r>
+        <w:t>12</w:t>
+      </w:r>
+      <w:r>
+        <w:fldChar w:fldCharType="end"/>
+      </w:r>
       <w:r>
         <w:t>. RL failure rate by difficulty-change frequency in the final evaluation episodes.</w:t>
       </w:r>
@@ -9215,16 +9335,19 @@
       </w:pPr>
       <w:bookmarkStart w:id="69" w:name="_Toc239303753"/>
       <w:r>
-        <w:t>4.7 Discussion in Relation to the Anchor Paper</w:t>
+        <w:t xml:space="preserve">4.7 </w:t>
       </w:r>
       <w:bookmarkEnd w:id="69"/>
+      <w:r>
+        <w:t>Comparison with Previous Research</w:t>
+      </w:r>
     </w:p>
     <w:p>
       <w:pPr>
         <w:jc w:val="both"/>
       </w:pPr>
       <w:r>
-        <w:t>The results support the central methodological claim taken from Climent et al. (2024): DDA can be framed as an RL problem in which states represent gameplay performance, actions alter difficulty and rewards encode desirable challenge outcomes. The present PPO controller successfully learned an actively changing difficulty policy rather than merely controlling the player or optimising an enemy for victory.</w:t>
+        <w:t>The results are broadly consistent with previous research showing that reinforcement learning can support dynamic difficulty adjustment, but they also show that the outcome depends strongly on the game, evaluation method and reward design. Climent et al. (2024) reported that their 2Q-table system improved the balance between wins and losses and produced personalised challenge for different players. In the present study, PPO also produced active difficulty adjustment, but it did not maintain a consistent 50% failure rate across all simulated profiles. Instead, performance varied by profile, with stronger results for beginner and improving behaviours and weaker results for skilled and inconsistent behaviours. This suggests that the general RL-DDA framework transfers to PPO, but the behaviour of the resulting controller is not identical to the tabular approach used by Climent et al. </w:t>
       </w:r>
     </w:p>
     <w:p>
@@ -9232,7 +9355,21 @@
         <w:jc w:val="both"/>
       </w:pPr>
       <w:r>
-        <w:t>The comparison also exposes an important difference. Climent et al. (2024) report a 2Q-table design that approximately balances winning and losing while extending rounds. The present PPO policy did not converge to a uniform 50% failure outcome across all simulated profiles. Instead, it produced a lower overall failure rate, highly reactive difficulty control and profile-dependent target-range performance. This suggests that the exact operational definition of 'balanced' and the reward/inference design remain decisive even when the high-level RL-DDA formulation is shared.</w:t>
+        <w:t xml:space="preserve">Similar variation can be seen in other RL-DDA studies. Rahimi et al. (2023) found that their continuous RL-based DDA system outperformed rule-based methods on several player-experience and performance measures, while Oliveira and </w:t>
+      </w:r>
+      <w:proofErr w:type="spellStart"/>
+      <w:r>
+        <w:t>Chaimowicz</w:t>
+      </w:r>
+      <w:proofErr w:type="spellEnd"/>
+      <w:r>
+        <w:t xml:space="preserve"> (2023) showed that reinforcement learning could create a more balanced opponent and that regularisation improved generalisation to unseen opponents. In contrast, the PPO controller in this dissertation was not consistently better than the rule-based baseline, particularly for skilled and inconsistent profiles. This difference highlights the importance of testing RL-based DDA across several behaviour types rather than </w:t>
+      </w:r>
+      <w:r>
+        <w:t>if</w:t>
+      </w:r>
+      <w:r>
+        <w:t xml:space="preserve"> an adaptive controller will perform equally well for all players.</w:t>
       </w:r>
     </w:p>
     <w:p>
@@ -9241,14 +9378,6 @@
       </w:pPr>
       <w:r>
         <w:t>The inference-mode finding extends the practical deployment discussion. Stochastic PPO sampling retained adaptive behaviour, while greedy selection collapsed to a fixed action pattern. This is not a failure of the DDA framing itself, but it is a concrete example of the implementation challenges highlighted by Climent et al. (2024) and by broader RL-DDA reviews such as Zheng (2024): the learned policy, reward design and deployment rule must all be considered together.</w:t>
-      </w:r>
-    </w:p>
-    <w:p>
-      <w:pPr>
-        <w:jc w:val="both"/>
-      </w:pPr>
-      <w:r>
-        <w:br w:type="page"/>
       </w:r>
     </w:p>
     <w:p>
@@ -10682,7 +10811,6 @@
   <w:style w:type="character" w:default="1" w:styleId="DefaultParagraphFont">
     <w:name w:val="Default Paragraph Font"/>
     <w:uiPriority w:val="1"/>
-    <w:semiHidden/>
     <w:unhideWhenUsed/>
   </w:style>
   <w:style w:type="table" w:default="1" w:styleId="TableNormal">

</xml_diff>